<commit_message>
Updated PACS Application Package Checklist, to v1.3.0, archived prev version
</commit_message>
<xml_diff>
--- a/docs/pacsapp-package-checklist.docx
+++ b/docs/pacsapp-package-checklist.docx
@@ -16,7 +16,7 @@
           <w:szCs w:val="36"/>
         </w:rPr>
       </w:pPr>
-      <w:bookmarkStart w:id="0" w:name="_ketnqpn2jrtu" w:colFirst="0" w:colLast="0"/>
+      <w:bookmarkStart w:id="0" w:name="_8zj5jzwrgijb" w:colFirst="0" w:colLast="0"/>
       <w:bookmarkEnd w:id="0"/>
       <w:r>
         <w:rPr>
@@ -39,7 +39,7 @@
           <w:szCs w:val="24"/>
         </w:rPr>
       </w:pPr>
-      <w:bookmarkStart w:id="1" w:name="_eyppjomznut5" w:colFirst="0" w:colLast="0"/>
+      <w:bookmarkStart w:id="1" w:name="_y2mm3pmxf1d1" w:colFirst="0" w:colLast="0"/>
       <w:bookmarkEnd w:id="1"/>
     </w:p>
     <w:p>
@@ -60,52 +60,7 @@
           <w:sz w:val="24"/>
           <w:szCs w:val="24"/>
         </w:rPr>
-        <w:t xml:space="preserve">This document serves as a checklist to assist </w:t>
-      </w:r>
-      <w:r>
-        <w:rPr>
-          <w:rFonts w:ascii="Times New Roman" w:eastAsia="Times New Roman" w:hAnsi="Times New Roman" w:cs="Times New Roman"/>
-          <w:color w:val="000000"/>
-          <w:sz w:val="24"/>
-          <w:szCs w:val="24"/>
-        </w:rPr>
-        <w:t>vendors</w:t>
-      </w:r>
-      <w:r>
-        <w:rPr>
-          <w:rFonts w:ascii="Times New Roman" w:eastAsia="Times New Roman" w:hAnsi="Times New Roman" w:cs="Times New Roman"/>
-          <w:color w:val="000000"/>
-          <w:sz w:val="24"/>
-          <w:szCs w:val="24"/>
-        </w:rPr>
-        <w:t xml:space="preserve"> in submitting their PACS solution application package</w:t>
-      </w:r>
-      <w:r>
-        <w:rPr>
-          <w:rFonts w:ascii="Times New Roman" w:eastAsia="Times New Roman" w:hAnsi="Times New Roman" w:cs="Times New Roman"/>
-          <w:color w:val="000000"/>
-          <w:sz w:val="24"/>
-          <w:szCs w:val="24"/>
-        </w:rPr>
-        <w:t>s</w:t>
-      </w:r>
-      <w:r>
-        <w:rPr>
-          <w:rFonts w:ascii="Times New Roman" w:eastAsia="Times New Roman" w:hAnsi="Times New Roman" w:cs="Times New Roman"/>
-          <w:color w:val="000000"/>
-          <w:sz w:val="24"/>
-          <w:szCs w:val="24"/>
-        </w:rPr>
-        <w:t xml:space="preserve">. It lists all the documents necessary for the program’s evaluation of the </w:t>
-      </w:r>
-      <w:r>
-        <w:rPr>
-          <w:rFonts w:ascii="Times New Roman" w:eastAsia="Times New Roman" w:hAnsi="Times New Roman" w:cs="Times New Roman"/>
-          <w:color w:val="000000"/>
-          <w:sz w:val="24"/>
-          <w:szCs w:val="24"/>
-        </w:rPr>
-        <w:t>solution and the issuance of an APL Letter.</w:t>
+        <w:t>This document serves as a checklist to assist vendors in submitting their PACS solution application packages. It lists all the documents necessary for the program’s evaluation of the solution and the issuance of an APL Letter.</w:t>
       </w:r>
     </w:p>
     <w:p>
@@ -142,7 +97,7 @@
           <w:szCs w:val="28"/>
         </w:rPr>
       </w:pPr>
-      <w:bookmarkStart w:id="2" w:name="_6r0eg360rp0i" w:colFirst="0" w:colLast="0"/>
+      <w:bookmarkStart w:id="2" w:name="_pu1o9aa43ud4" w:colFirst="0" w:colLast="0"/>
       <w:bookmarkEnd w:id="2"/>
       <w:r>
         <w:rPr>
@@ -217,7 +172,6 @@
               <w:bottom w:val="single" w:sz="4" w:space="0" w:color="000000"/>
               <w:right w:val="single" w:sz="4" w:space="0" w:color="000000"/>
             </w:tcBorders>
-            <w:shd w:val="clear" w:color="auto" w:fill="auto"/>
           </w:tcPr>
           <w:p>
             <w:pPr>
@@ -273,7 +227,6 @@
               <w:bottom w:val="single" w:sz="4" w:space="0" w:color="000000"/>
               <w:right w:val="single" w:sz="4" w:space="0" w:color="000000"/>
             </w:tcBorders>
-            <w:shd w:val="clear" w:color="auto" w:fill="auto"/>
           </w:tcPr>
           <w:p>
             <w:pPr>
@@ -331,7 +284,6 @@
               <w:bottom w:val="single" w:sz="4" w:space="0" w:color="000000"/>
               <w:right w:val="single" w:sz="4" w:space="0" w:color="000000"/>
             </w:tcBorders>
-            <w:shd w:val="clear" w:color="auto" w:fill="auto"/>
           </w:tcPr>
           <w:p>
             <w:pPr>
@@ -391,43 +343,7 @@
           <w:sz w:val="24"/>
           <w:szCs w:val="24"/>
         </w:rPr>
-        <w:t>The applicant must indicate “Yes” or “No” for each document</w:t>
-      </w:r>
-      <w:r>
-        <w:rPr>
-          <w:rFonts w:ascii="Times New Roman" w:eastAsia="Times New Roman" w:hAnsi="Times New Roman" w:cs="Times New Roman"/>
-          <w:color w:val="000000"/>
-          <w:sz w:val="24"/>
-          <w:szCs w:val="24"/>
-        </w:rPr>
-        <w:t>,</w:t>
-      </w:r>
-      <w:r>
-        <w:rPr>
-          <w:rFonts w:ascii="Times New Roman" w:eastAsia="Times New Roman" w:hAnsi="Times New Roman" w:cs="Times New Roman"/>
-          <w:color w:val="000000"/>
-          <w:sz w:val="24"/>
-          <w:szCs w:val="24"/>
-        </w:rPr>
-        <w:t xml:space="preserve"> </w:t>
-      </w:r>
-      <w:r>
-        <w:rPr>
-          <w:rFonts w:ascii="Times New Roman" w:eastAsia="Times New Roman" w:hAnsi="Times New Roman" w:cs="Times New Roman"/>
-          <w:color w:val="000000"/>
-          <w:sz w:val="24"/>
-          <w:szCs w:val="24"/>
-        </w:rPr>
-        <w:t>providing</w:t>
-      </w:r>
-      <w:r>
-        <w:rPr>
-          <w:rFonts w:ascii="Times New Roman" w:eastAsia="Times New Roman" w:hAnsi="Times New Roman" w:cs="Times New Roman"/>
-          <w:color w:val="000000"/>
-          <w:sz w:val="24"/>
-          <w:szCs w:val="24"/>
-        </w:rPr>
-        <w:t xml:space="preserve"> an explanation in the Comments column if a particular document is not submitted (e.g., N/A). </w:t>
+        <w:t xml:space="preserve">The applicant must indicate “Yes” or “No” for each document, providing an explanation in the Comments column if a particular document is not submitted (e.g., N/A). </w:t>
       </w:r>
     </w:p>
     <w:tbl>
@@ -690,7 +606,7 @@
                 <w:color w:val="0000FF"/>
                 <w:u w:val="single"/>
               </w:rPr>
-              <w:t>2</w:t>
+              <w:t>3</w:t>
             </w:r>
             <w:r>
               <w:rPr>
@@ -1174,14 +1090,26 @@
                   <w:color w:val="0000FF"/>
                   <w:u w:val="single"/>
                 </w:rPr>
-                <w:t>Completed PACS FRTC Workbook, v1.4.2 Rev B</w:t>
+                <w:t>Completed PACS FRTC Workbook, v1.4.2 Rev D</w:t>
               </w:r>
             </w:hyperlink>
             <w:r>
               <w:rPr>
                 <w:rFonts w:ascii="Times New Roman" w:eastAsia="Times New Roman" w:hAnsi="Times New Roman" w:cs="Times New Roman"/>
               </w:rPr>
-              <w:t xml:space="preserve"> (MS Excel, October 2021) </w:t>
+              <w:t xml:space="preserve"> (MS Excel, </w:t>
+            </w:r>
+            <w:r>
+              <w:rPr>
+                <w:rFonts w:ascii="Times New Roman" w:eastAsia="Times New Roman" w:hAnsi="Times New Roman" w:cs="Times New Roman"/>
+              </w:rPr>
+              <w:t>August 2025</w:t>
+            </w:r>
+            <w:r>
+              <w:rPr>
+                <w:rFonts w:ascii="Times New Roman" w:eastAsia="Times New Roman" w:hAnsi="Times New Roman" w:cs="Times New Roman"/>
+              </w:rPr>
+              <w:t xml:space="preserve">) </w:t>
             </w:r>
             <w:r>
               <w:rPr>
@@ -1880,7 +1808,19 @@
               <w:rPr>
                 <w:rFonts w:ascii="Times New Roman" w:eastAsia="Times New Roman" w:hAnsi="Times New Roman" w:cs="Times New Roman"/>
               </w:rPr>
-              <w:t xml:space="preserve">Documentation of UL certifications (UL294, UL 1076, UL 1981) </w:t>
+              <w:t>Documentation of UL certifications (UL294, UL 1076, UL 1981</w:t>
+            </w:r>
+            <w:r>
+              <w:rPr>
+                <w:rFonts w:ascii="Times New Roman" w:eastAsia="Times New Roman" w:hAnsi="Times New Roman" w:cs="Times New Roman"/>
+              </w:rPr>
+              <w:t>, UL2610</w:t>
+            </w:r>
+            <w:r>
+              <w:rPr>
+                <w:rFonts w:ascii="Times New Roman" w:eastAsia="Times New Roman" w:hAnsi="Times New Roman" w:cs="Times New Roman"/>
+              </w:rPr>
+              <w:t xml:space="preserve">) </w:t>
             </w:r>
             <w:r>
               <w:rPr>
@@ -2212,7 +2152,7 @@
                   <w:color w:val="0000FF"/>
                   <w:u w:val="single"/>
                 </w:rPr>
-                <w:t>Vendor FRTC Questionnaire, v1.2.0</w:t>
+                <w:t>Vendor FRTC Questionnaire, v1.3.0</w:t>
               </w:r>
             </w:hyperlink>
             <w:r>
@@ -2295,6 +2235,14 @@
           <w:sz w:val="24"/>
           <w:szCs w:val="24"/>
         </w:rPr>
+        <w:sectPr>
+          <w:headerReference w:type="default" r:id="rId18"/>
+          <w:footerReference w:type="default" r:id="rId19"/>
+          <w:pgSz w:w="12240" w:h="15840"/>
+          <w:pgMar w:top="1440" w:right="1440" w:bottom="1440" w:left="1440" w:header="720" w:footer="720" w:gutter="0"/>
+          <w:pgNumType w:start="1"/>
+          <w:cols w:space="720"/>
+        </w:sectPr>
       </w:pPr>
       <w:r>
         <w:rPr>
@@ -2304,9 +2252,12 @@
           <w:sz w:val="24"/>
           <w:szCs w:val="24"/>
         </w:rPr>
-        <w:t xml:space="preserve">Note: All documents </w:t>
+        <w:t>Note: All documents marked with an asterisk (*) must be completed, signed, and provided at the time of application submission to be eligible for addition to the testing and evaluation queue.</w:t>
       </w:r>
-      <w:r>
+    </w:p>
+    <w:p>
+      <w:pPr>
+        <w:spacing w:before="89"/>
         <w:rPr>
           <w:rFonts w:ascii="Times New Roman" w:eastAsia="Times New Roman" w:hAnsi="Times New Roman" w:cs="Times New Roman"/>
           <w:b/>
@@ -2314,78 +2265,7 @@
           <w:sz w:val="24"/>
           <w:szCs w:val="24"/>
         </w:rPr>
-        <w:t xml:space="preserve">marked </w:t>
-      </w:r>
-      <w:r>
-        <w:rPr>
-          <w:rFonts w:ascii="Times New Roman" w:eastAsia="Times New Roman" w:hAnsi="Times New Roman" w:cs="Times New Roman"/>
-          <w:b/>
-          <w:color w:val="000000"/>
-          <w:sz w:val="24"/>
-          <w:szCs w:val="24"/>
-        </w:rPr>
-        <w:t xml:space="preserve">with an </w:t>
-      </w:r>
-      <w:r>
-        <w:rPr>
-          <w:rFonts w:ascii="Times New Roman" w:eastAsia="Times New Roman" w:hAnsi="Times New Roman" w:cs="Times New Roman"/>
-          <w:b/>
-          <w:color w:val="000000"/>
-          <w:sz w:val="24"/>
-          <w:szCs w:val="24"/>
-        </w:rPr>
-        <w:t>asterisk</w:t>
-      </w:r>
-      <w:r>
-        <w:rPr>
-          <w:rFonts w:ascii="Times New Roman" w:eastAsia="Times New Roman" w:hAnsi="Times New Roman" w:cs="Times New Roman"/>
-          <w:b/>
-          <w:color w:val="000000"/>
-          <w:sz w:val="24"/>
-          <w:szCs w:val="24"/>
-        </w:rPr>
-        <w:t xml:space="preserve"> </w:t>
-      </w:r>
-      <w:r>
-        <w:rPr>
-          <w:rFonts w:ascii="Times New Roman" w:eastAsia="Times New Roman" w:hAnsi="Times New Roman" w:cs="Times New Roman"/>
-          <w:b/>
-          <w:color w:val="000000"/>
-          <w:sz w:val="24"/>
-          <w:szCs w:val="24"/>
-        </w:rPr>
-        <w:t>(*)</w:t>
-      </w:r>
-      <w:r>
-        <w:rPr>
-          <w:rFonts w:ascii="Times New Roman" w:eastAsia="Times New Roman" w:hAnsi="Times New Roman" w:cs="Times New Roman"/>
-          <w:b/>
-          <w:color w:val="000000"/>
-          <w:sz w:val="24"/>
-          <w:szCs w:val="24"/>
-        </w:rPr>
-        <w:t xml:space="preserve"> </w:t>
-      </w:r>
-      <w:r>
-        <w:rPr>
-          <w:rFonts w:ascii="Times New Roman" w:eastAsia="Times New Roman" w:hAnsi="Times New Roman" w:cs="Times New Roman"/>
-          <w:b/>
-          <w:color w:val="000000"/>
-          <w:sz w:val="24"/>
-          <w:szCs w:val="24"/>
-        </w:rPr>
-        <w:t>must</w:t>
-      </w:r>
-      <w:r>
-        <w:rPr>
-          <w:rFonts w:ascii="Times New Roman" w:eastAsia="Times New Roman" w:hAnsi="Times New Roman" w:cs="Times New Roman"/>
-          <w:b/>
-          <w:color w:val="000000"/>
-          <w:sz w:val="24"/>
-          <w:szCs w:val="24"/>
-        </w:rPr>
-        <w:t xml:space="preserve"> be completed, signed, and provided at the time of application submission to be eligible for addition to the testing and evaluation queue. </w:t>
-      </w:r>
+      </w:pPr>
     </w:p>
     <w:p>
       <w:pPr>
@@ -2411,7 +2291,6 @@
           <w:sz w:val="28"/>
           <w:szCs w:val="28"/>
         </w:rPr>
-        <w:lastRenderedPageBreak/>
         <w:t>Schedule installation and solution walk-through</w:t>
       </w:r>
     </w:p>
@@ -2435,7 +2314,6 @@
         </w:rPr>
         <w:t xml:space="preserve">After the submission and approval of the </w:t>
       </w:r>
-      <w:proofErr w:type="gramStart"/>
       <w:r>
         <w:rPr>
           <w:rFonts w:ascii="Times New Roman" w:eastAsia="Times New Roman" w:hAnsi="Times New Roman" w:cs="Times New Roman"/>
@@ -2443,9 +2321,8 @@
           <w:sz w:val="24"/>
           <w:szCs w:val="24"/>
         </w:rPr>
-        <w:t>aforementioned application</w:t>
+        <w:t>application</w:t>
       </w:r>
-      <w:proofErr w:type="gramEnd"/>
       <w:r>
         <w:rPr>
           <w:rFonts w:ascii="Times New Roman" w:eastAsia="Times New Roman" w:hAnsi="Times New Roman" w:cs="Times New Roman"/>
@@ -2749,7 +2626,14 @@
                 <w:rFonts w:ascii="Times New Roman" w:eastAsia="Times New Roman" w:hAnsi="Times New Roman" w:cs="Times New Roman"/>
                 <w:color w:val="000000"/>
               </w:rPr>
-              <w:t>to include reviewing the Vendor FRTC Questionnaire, v1.0.0</w:t>
+              <w:t>to include reviewing the Vendor FRTC Questionnaire</w:t>
+            </w:r>
+            <w:r>
+              <w:rPr>
+                <w:rFonts w:ascii="Times New Roman" w:eastAsia="Times New Roman" w:hAnsi="Times New Roman" w:cs="Times New Roman"/>
+                <w:color w:val="000000"/>
+              </w:rPr>
+              <w:t>.</w:t>
             </w:r>
           </w:p>
         </w:tc>
@@ -2865,8 +2749,6 @@
       </w:pPr>
     </w:p>
     <w:sectPr>
-      <w:headerReference w:type="default" r:id="rId18"/>
-      <w:footerReference w:type="default" r:id="rId19"/>
       <w:pgSz w:w="12240" w:h="15840"/>
       <w:pgMar w:top="1440" w:right="1440" w:bottom="1440" w:left="1440" w:header="720" w:footer="720" w:gutter="0"/>
       <w:pgNumType w:start="1"/>
@@ -3033,7 +2915,7 @@
         <w:sz w:val="28"/>
         <w:szCs w:val="28"/>
       </w:rPr>
-      <w:t>2</w:t>
+      <w:t>3</w:t>
     </w:r>
     <w:r>
       <w:rPr>
@@ -3051,9 +2933,9 @@
 <file path=word/numbering.xml><?xml version="1.0" encoding="utf-8"?>
 <w:numbering xmlns:wpc="http://schemas.microsoft.com/office/word/2010/wordprocessingCanvas" xmlns:cx="http://schemas.microsoft.com/office/drawing/2014/chartex" xmlns:cx1="http://schemas.microsoft.com/office/drawing/2015/9/8/chartex" xmlns:cx2="http://schemas.microsoft.com/office/drawing/2015/10/21/chartex" xmlns:cx3="http://schemas.microsoft.com/office/drawing/2016/5/9/chartex" xmlns:cx4="http://schemas.microsoft.com/office/drawing/2016/5/10/chartex" xmlns:cx5="http://schemas.microsoft.com/office/drawing/2016/5/11/chartex" xmlns:cx6="http://schemas.microsoft.com/office/drawing/2016/5/12/chartex" xmlns:cx7="http://schemas.microsoft.com/office/drawing/2016/5/13/chartex" xmlns:cx8="http://schemas.microsoft.com/office/drawing/2016/5/14/chartex" xmlns:mc="http://schemas.openxmlformats.org/markup-compatibility/2006" xmlns:aink="http://schemas.microsoft.com/office/drawing/2016/ink" xmlns:am3d="http://schemas.microsoft.com/office/drawing/2017/model3d" xmlns:o="urn:schemas-microsoft-com:office:office" xmlns:oel="http://schemas.microsoft.com/office/2019/extlst" xmlns:r="http://schemas.openxmlformats.org/officeDocument/2006/relationships" xmlns:m="http://schemas.openxmlformats.org/officeDocument/2006/math" xmlns:v="urn:schemas-microsoft-com:vml" xmlns:wp14="http://schemas.microsoft.com/office/word/2010/wordprocessingDrawing" xmlns:wp="http://schemas.openxmlformats.org/drawingml/2006/wordprocessingDrawing" xmlns:w10="urn:schemas-microsoft-com:office:word" xmlns:w="http://schemas.openxmlformats.org/wordprocessingml/2006/main" xmlns:w14="http://schemas.microsoft.com/office/word/2010/wordml" xmlns:w15="http://schemas.microsoft.com/office/word/2012/wordml" xmlns:w16cex="http://schemas.microsoft.com/office/word/2018/wordml/cex" xmlns:w16cid="http://schemas.microsoft.com/office/word/2016/wordml/cid" xmlns:w16="http://schemas.microsoft.com/office/word/2018/wordml" xmlns:w16du="http://schemas.microsoft.com/office/word/2023/wordml/word16du" xmlns:w16sdtdh="http://schemas.microsoft.com/office/word/2020/wordml/sdtdatahash" xmlns:w16sdtfl="http://schemas.microsoft.com/office/word/2024/wordml/sdtformatlock" xmlns:w16se="http://schemas.microsoft.com/office/word/2015/wordml/symex" xmlns:wpg="http://schemas.microsoft.com/office/word/2010/wordprocessingGroup" xmlns:wpi="http://schemas.microsoft.com/office/word/2010/wordprocessingInk" xmlns:wne="http://schemas.microsoft.com/office/word/2006/wordml" xmlns:wps="http://schemas.microsoft.com/office/word/2010/wordprocessingShape" mc:Ignorable="w14 w15 w16se w16cid w16 w16cex w16sdtdh w16sdtfl w16du wp14">
   <w:abstractNum w:abstractNumId="0" w15:restartNumberingAfterBreak="0">
-    <w:nsid w:val="0D720241"/>
+    <w:nsid w:val="6AE930BA"/>
     <w:multiLevelType w:val="multilevel"/>
-    <w:tmpl w:val="2ADEE89E"/>
+    <w:tmpl w:val="08F87F6E"/>
     <w:lvl w:ilvl="0">
       <w:start w:val="1"/>
       <w:numFmt w:val="decimal"/>
@@ -3136,7 +3018,7 @@
       </w:pPr>
     </w:lvl>
   </w:abstractNum>
-  <w:num w:numId="1" w16cid:durableId="1740594800">
+  <w:num w:numId="1" w16cid:durableId="1887908984">
     <w:abstractNumId w:val="0"/>
   </w:num>
 </w:numbering>
@@ -3684,6 +3566,17 @@
     <w:semiHidden/>
     <w:unhideWhenUsed/>
   </w:style>
+  <w:style w:type="table" w:customStyle="1" w:styleId="TableNormal0">
+    <w:name w:val="TableNormal"/>
+    <w:tblPr>
+      <w:tblCellMar>
+        <w:top w:w="0" w:type="dxa"/>
+        <w:left w:w="0" w:type="dxa"/>
+        <w:bottom w:w="0" w:type="dxa"/>
+        <w:right w:w="0" w:type="dxa"/>
+      </w:tblCellMar>
+    </w:tblPr>
+  </w:style>
   <w:style w:type="paragraph" w:styleId="Title">
     <w:name w:val="Title"/>
     <w:basedOn w:val="Normal"/>
@@ -3718,34 +3611,40 @@
     </w:rPr>
   </w:style>
   <w:style w:type="table" w:customStyle="1" w:styleId="a">
-    <w:basedOn w:val="TableNormal"/>
+    <w:basedOn w:val="TableNormal0"/>
     <w:tblPr>
       <w:tblStyleRowBandSize w:val="1"/>
       <w:tblStyleColBandSize w:val="1"/>
       <w:tblCellMar>
+        <w:top w:w="0" w:type="dxa"/>
         <w:left w:w="115" w:type="dxa"/>
+        <w:bottom w:w="0" w:type="dxa"/>
         <w:right w:w="115" w:type="dxa"/>
       </w:tblCellMar>
     </w:tblPr>
   </w:style>
   <w:style w:type="table" w:customStyle="1" w:styleId="a0">
-    <w:basedOn w:val="TableNormal"/>
+    <w:basedOn w:val="TableNormal0"/>
     <w:tblPr>
       <w:tblStyleRowBandSize w:val="1"/>
       <w:tblStyleColBandSize w:val="1"/>
       <w:tblCellMar>
+        <w:top w:w="0" w:type="dxa"/>
         <w:left w:w="115" w:type="dxa"/>
+        <w:bottom w:w="0" w:type="dxa"/>
         <w:right w:w="115" w:type="dxa"/>
       </w:tblCellMar>
     </w:tblPr>
   </w:style>
   <w:style w:type="table" w:customStyle="1" w:styleId="a1">
-    <w:basedOn w:val="TableNormal"/>
+    <w:basedOn w:val="TableNormal0"/>
     <w:tblPr>
       <w:tblStyleRowBandSize w:val="1"/>
       <w:tblStyleColBandSize w:val="1"/>
       <w:tblCellMar>
+        <w:top w:w="0" w:type="dxa"/>
         <w:left w:w="115" w:type="dxa"/>
+        <w:bottom w:w="0" w:type="dxa"/>
         <w:right w:w="115" w:type="dxa"/>
       </w:tblCellMar>
     </w:tblPr>
@@ -3756,7 +3655,7 @@
     <w:link w:val="HeaderChar"/>
     <w:uiPriority w:val="99"/>
     <w:unhideWhenUsed/>
-    <w:rsid w:val="00CF043B"/>
+    <w:rsid w:val="00054501"/>
     <w:pPr>
       <w:tabs>
         <w:tab w:val="center" w:pos="4680"/>
@@ -3770,7 +3669,7 @@
     <w:basedOn w:val="DefaultParagraphFont"/>
     <w:link w:val="Header"/>
     <w:uiPriority w:val="99"/>
-    <w:rsid w:val="00CF043B"/>
+    <w:rsid w:val="00054501"/>
   </w:style>
   <w:style w:type="paragraph" w:styleId="Footer">
     <w:name w:val="footer"/>
@@ -3778,7 +3677,7 @@
     <w:link w:val="FooterChar"/>
     <w:uiPriority w:val="99"/>
     <w:unhideWhenUsed/>
-    <w:rsid w:val="00CF043B"/>
+    <w:rsid w:val="00054501"/>
     <w:pPr>
       <w:tabs>
         <w:tab w:val="center" w:pos="4680"/>
@@ -3792,7 +3691,7 @@
     <w:basedOn w:val="DefaultParagraphFont"/>
     <w:link w:val="Footer"/>
     <w:uiPriority w:val="99"/>
-    <w:rsid w:val="00CF043B"/>
+    <w:rsid w:val="00054501"/>
   </w:style>
 </w:styles>
 </file>

</xml_diff>